<commit_message>
alteração para revisão final de artigo
</commit_message>
<xml_diff>
--- a/docs/Artigo Similaridade Facial.docx
+++ b/docs/Artigo Similaridade Facial.docx
@@ -4,7 +4,6 @@
   <w:body>
     <w:p>
       <w:pPr>
-        <w:keepNext w:val="0"/>
         <w:ind w:firstLine="0"/>
         <w:jc w:val="center"/>
         <w:rPr>
@@ -17,7 +16,6 @@
     </w:p>
     <w:p>
       <w:pPr>
-        <w:keepNext w:val="0"/>
         <w:ind w:firstLine="0"/>
         <w:jc w:val="center"/>
         <w:rPr>
@@ -30,7 +28,6 @@
     </w:p>
     <w:p>
       <w:pPr>
-        <w:keepNext w:val="0"/>
         <w:ind w:firstLine="0"/>
         <w:jc w:val="center"/>
         <w:rPr>
@@ -49,7 +46,6 @@
     </w:p>
     <w:p>
       <w:pPr>
-        <w:keepNext w:val="0"/>
         <w:ind w:firstLine="0"/>
         <w:jc w:val="center"/>
         <w:rPr>
@@ -67,7 +63,6 @@
     </w:p>
     <w:p>
       <w:pPr>
-        <w:keepNext w:val="0"/>
         <w:ind w:firstLine="0"/>
         <w:jc w:val="center"/>
         <w:rPr>
@@ -113,7 +108,6 @@
     <w:p>
       <w:pPr>
         <w:pStyle w:val="Heading1"/>
-        <w:keepNext/>
         <w:rPr>
           <w:color w:val="auto"/>
         </w:rPr>
@@ -129,7 +123,6 @@
     </w:p>
     <w:p>
       <w:pPr>
-        <w:keepNext w:val="0"/>
         <w:ind w:firstLine="0"/>
         <w:rPr>
           <w:color w:val="auto"/>
@@ -141,7 +134,6 @@
     </w:p>
     <w:p>
       <w:pPr>
-        <w:keepNext w:val="0"/>
         <w:ind w:firstLine="0"/>
         <w:rPr>
           <w:color w:val="auto"/>
@@ -168,7 +160,6 @@
     <w:p>
       <w:pPr>
         <w:pStyle w:val="Heading1"/>
-        <w:keepNext/>
         <w:rPr>
           <w:color w:val="auto"/>
         </w:rPr>
@@ -182,7 +173,6 @@
     </w:p>
     <w:p>
       <w:pPr>
-        <w:keepNext w:val="0"/>
         <w:ind w:firstLine="0"/>
         <w:rPr>
           <w:color w:val="auto"/>
@@ -194,7 +184,6 @@
     </w:p>
     <w:p>
       <w:pPr>
-        <w:keepNext w:val="0"/>
         <w:ind w:firstLine="0"/>
         <w:rPr>
           <w:color w:val="auto"/>
@@ -221,7 +210,6 @@
     <w:p>
       <w:pPr>
         <w:pStyle w:val="Heading1"/>
-        <w:keepNext/>
         <w:rPr>
           <w:color w:val="auto"/>
         </w:rPr>
@@ -230,12 +218,12 @@
         <w:rPr>
           <w:color w:val="auto"/>
         </w:rPr>
+        <w:lastRenderedPageBreak/>
         <w:t>1 Introdução</w:t>
       </w:r>
     </w:p>
     <w:p>
       <w:pPr>
-        <w:keepNext w:val="0"/>
         <w:rPr>
           <w:color w:val="auto"/>
         </w:rPr>
@@ -246,7 +234,6 @@
     </w:p>
     <w:p>
       <w:pPr>
-        <w:keepNext w:val="0"/>
         <w:rPr>
           <w:color w:val="auto"/>
         </w:rPr>
@@ -257,7 +244,6 @@
     </w:p>
     <w:p>
       <w:pPr>
-        <w:keepNext w:val="0"/>
         <w:rPr>
           <w:color w:val="auto"/>
         </w:rPr>
@@ -268,7 +254,6 @@
     </w:p>
     <w:p>
       <w:pPr>
-        <w:keepNext w:val="0"/>
         <w:rPr>
           <w:color w:val="auto"/>
         </w:rPr>
@@ -278,7 +263,6 @@
       </w:r>
     </w:p>
     <w:p>
-      <w:pPr/>
       <w:r>
         <w:t>As perguntas de pesquisa são: RQ1. Quais estágios institucionais e técnicos condicionam a inclusão de registros no corpus auditado? RQ2. Em que medida as partições e o cluster-alvo permanecem estáveis sob alterações controladas de ordem, minibatch e representação? RQ3. Em que medida escores internos recuperam um rótulo endógeno, em vez de validar um construto externo? RQ4. Quais alegações são identificáveis, diagnosticáveis ou não identificáveis com as variáveis, unidades e denominadores disponíveis?</w:t>
       </w:r>
@@ -286,7 +270,6 @@
     <w:p>
       <w:pPr>
         <w:pStyle w:val="Heading1"/>
-        <w:keepNext/>
         <w:rPr>
           <w:color w:val="auto"/>
         </w:rPr>
@@ -301,7 +284,6 @@
     <w:p>
       <w:pPr>
         <w:pStyle w:val="Heading2"/>
-        <w:keepNext/>
         <w:rPr>
           <w:color w:val="auto"/>
         </w:rPr>
@@ -315,7 +297,6 @@
     </w:p>
     <w:p>
       <w:pPr>
-        <w:keepNext w:val="0"/>
         <w:rPr>
           <w:color w:val="auto"/>
         </w:rPr>
@@ -327,7 +308,6 @@
     <w:p>
       <w:pPr>
         <w:pStyle w:val="Heading2"/>
-        <w:keepNext/>
         <w:rPr>
           <w:color w:val="auto"/>
         </w:rPr>
@@ -336,12 +316,12 @@
         <w:rPr>
           <w:color w:val="auto"/>
         </w:rPr>
+        <w:lastRenderedPageBreak/>
         <w:t>2.2 Matriz de auditoria e classes de identificabilidade</w:t>
       </w:r>
     </w:p>
     <w:p>
       <w:pPr>
-        <w:keepNext w:val="0"/>
         <w:rPr>
           <w:color w:val="auto"/>
         </w:rPr>
@@ -351,21 +331,12 @@
           <w:rFonts w:eastAsia="Arial"/>
           <w:color w:val="auto"/>
         </w:rPr>
-        <w:t xml:space="preserve">Cada alegação foi classificada antes da análise. “Identificável” designa uma grandeza com variável, unidade e denominador observáveis no snapshot. “Diagnosticável” designa propriedade </w:t>
-      </w:r>
-      <w:r>
-        <w:rPr>
-          <w:rFonts w:eastAsia="Arial"/>
-          <w:color w:val="auto"/>
-        </w:rPr>
-        <w:lastRenderedPageBreak/>
-        <w:t>interna que pode ser testada sem representar o construto social de interesse. “Não identificável” designa estimando para o qual faltam variáveis, denominadores ou contrafactuais essenciais. Essa classificação evita tratar ausência de evidência como evidência de ausência.</w:t>
+        <w:t>Cada alegação foi classificada antes da análise. “Identificável” designa uma grandeza com variável, unidade e denominador observáveis no snapshot. “Diagnosticável” designa propriedade interna que pode ser testada sem representar o construto social de interesse. “Não identificável” designa estimando para o qual faltam variáveis, denominadores ou contrafactuais essenciais. Essa classificação evita tratar ausência de evidência como evidência de ausência.</w:t>
       </w:r>
     </w:p>
     <w:p>
       <w:pPr>
         <w:pStyle w:val="Caption"/>
-        <w:keepNext/>
         <w:rPr>
           <w:color w:val="auto"/>
         </w:rPr>
@@ -1293,7 +1264,6 @@
     </w:tbl>
     <w:p>
       <w:pPr>
-        <w:keepNext w:val="0"/>
         <w:spacing w:before="60" w:after="120"/>
         <w:ind w:firstLine="0"/>
         <w:rPr>
@@ -1313,7 +1283,6 @@
     <w:p>
       <w:pPr>
         <w:pStyle w:val="Heading2"/>
-        <w:keepNext/>
         <w:rPr>
           <w:color w:val="auto"/>
         </w:rPr>
@@ -1327,7 +1296,6 @@
     </w:p>
     <w:p>
       <w:pPr>
-        <w:keepNext w:val="0"/>
         <w:rPr>
           <w:color w:val="auto"/>
         </w:rPr>
@@ -1339,7 +1307,6 @@
     <w:p>
       <w:pPr>
         <w:pStyle w:val="Heading2"/>
-        <w:keepNext/>
         <w:rPr>
           <w:color w:val="auto"/>
         </w:rPr>
@@ -1350,7 +1317,6 @@
     </w:p>
     <w:p>
       <w:pPr>
-        <w:keepNext w:val="0"/>
         <w:rPr>
           <w:color w:val="auto"/>
         </w:rPr>
@@ -1362,7 +1328,6 @@
     <w:p>
       <w:pPr>
         <w:pStyle w:val="Heading2"/>
-        <w:keepNext/>
         <w:rPr>
           <w:color w:val="auto"/>
         </w:rPr>
@@ -1376,19 +1341,21 @@
     </w:p>
     <w:p>
       <w:pPr>
-        <w:keepNext w:val="0"/>
         <w:rPr>
           <w:color w:val="auto"/>
         </w:rPr>
       </w:pPr>
       <w:r>
-        <w:t>O método de referência utiliza embeddings L2-normalizados e MiniBatchKMeans. As análises de sensibilidade são classificadas como sensibilidade, não como escolha retrospectiva de configuração: ordem dos registros, batch_size e PCA-64 foram comparados com a configuração de referência. A corrida de desenvolvimento planejada com 20 sementes e seis valores de k não terminou na janela operacional e foi interrompida sem manifesto final; nenhum resultado parcial dessa corrida é tratado como válido.</w:t>
+        <w:t xml:space="preserve">O método de referência utiliza embeddings L2-normalizados e MiniBatchKMeans. As análises de sensibilidade são classificadas como sensibilidade, não como escolha retrospectiva de configuração: ordem dos registros, batch_size e PCA-64 foram comparados com a configuração de referência. A </w:t>
+      </w:r>
+      <w:r>
+        <w:lastRenderedPageBreak/>
+        <w:t>corrida de desenvolvimento planejada com 20 sementes e seis valores de k não terminou na janela operacional e foi interrompida sem manifesto final; nenhum resultado parcial dessa corrida é tratado como válido.</w:t>
       </w:r>
     </w:p>
     <w:p>
       <w:pPr>
         <w:pStyle w:val="Heading2"/>
-        <w:keepNext/>
         <w:rPr>
           <w:color w:val="auto"/>
         </w:rPr>
@@ -1402,7 +1369,6 @@
     </w:p>
     <w:p>
       <w:pPr>
-        <w:keepNext w:val="0"/>
         <w:rPr>
           <w:color w:val="auto"/>
         </w:rPr>
@@ -1414,7 +1380,6 @@
     <w:p>
       <w:pPr>
         <w:pStyle w:val="Heading2"/>
-        <w:keepNext/>
         <w:rPr>
           <w:color w:val="auto"/>
         </w:rPr>
@@ -1425,7 +1390,6 @@
     </w:p>
     <w:p>
       <w:pPr>
-        <w:keepNext w:val="0"/>
         <w:rPr>
           <w:color w:val="auto"/>
         </w:rPr>
@@ -1437,7 +1401,6 @@
     <w:p>
       <w:pPr>
         <w:pStyle w:val="Heading2"/>
-        <w:keepNext/>
         <w:rPr>
           <w:color w:val="auto"/>
         </w:rPr>
@@ -1452,7 +1415,6 @@
     <w:p>
       <w:pPr>
         <w:pStyle w:val="Caption"/>
-        <w:keepNext/>
         <w:rPr>
           <w:color w:val="auto"/>
         </w:rPr>
@@ -1900,7 +1862,6 @@
                 <w:color w:val="auto"/>
                 <w:sz w:val="17"/>
               </w:rPr>
-              <w:lastRenderedPageBreak/>
               <w:t>Replicação independente</w:t>
             </w:r>
           </w:p>
@@ -1971,7 +1932,6 @@
     </w:tbl>
     <w:p>
       <w:pPr>
-        <w:keepNext w:val="0"/>
         <w:spacing w:before="60" w:after="120"/>
         <w:ind w:firstLine="0"/>
         <w:rPr>
@@ -1985,7 +1945,6 @@
     <w:p>
       <w:pPr>
         <w:pStyle w:val="Heading1"/>
-        <w:keepNext/>
         <w:rPr>
           <w:color w:val="auto"/>
         </w:rPr>
@@ -2000,7 +1959,6 @@
     <w:p>
       <w:pPr>
         <w:pStyle w:val="Heading2"/>
-        <w:keepNext/>
         <w:rPr>
           <w:color w:val="auto"/>
         </w:rPr>
@@ -2014,19 +1972,21 @@
     </w:p>
     <w:p>
       <w:pPr>
-        <w:keepNext w:val="0"/>
         <w:rPr>
           <w:color w:val="auto"/>
         </w:rPr>
       </w:pPr>
       <w:r>
-        <w:t>O estado preservado contém 9.584 linhas no manifesto analítico e 9.482 embeddings válidos. A matriz de embeddings tem 512 dimensões. Há imagens alinhadas, manifestos, embeddings e relatórios de pré-processamento. Os números históricos de 11.724 registros brutos, 9.764 entradas na padronização e 9.546 processamentos bem-sucedidos são mantidos apenas como reconciliação documental de estágios, pois o artefato bruto integral não estava disponível para auditoria independente nesta revisão. Entre as 102 falhas finais documentadas, 98 foram registradas como ausência de face detectável e quatro como múltiplas faces. Cobertura técnica não equivale a robustez biométrica.</w:t>
+        <w:t xml:space="preserve">O estado preservado contém 9.584 linhas no manifesto analítico e 9.482 embeddings válidos. A matriz de embeddings tem 512 dimensões. Há imagens alinhadas, manifestos, embeddings e relatórios de pré-processamento. Os números históricos de 11.724 registros brutos, 9.764 entradas na padronização e 9.546 processamentos bem-sucedidos são mantidos apenas como reconciliação documental de estágios, pois o artefato bruto integral não estava disponível para auditoria independente </w:t>
+      </w:r>
+      <w:r>
+        <w:lastRenderedPageBreak/>
+        <w:t>nesta revisão. Entre as 102 falhas finais documentadas, 98 foram registradas como ausência de face detectável e quatro como múltiplas faces. Cobertura técnica não equivale a robustez biométrica.</w:t>
       </w:r>
     </w:p>
     <w:p>
       <w:pPr>
         <w:pStyle w:val="Caption"/>
-        <w:keepNext/>
         <w:rPr>
           <w:color w:val="auto"/>
         </w:rPr>
@@ -2814,7 +2774,6 @@
     </w:tbl>
     <w:p>
       <w:pPr>
-        <w:keepNext w:val="0"/>
         <w:spacing w:before="60" w:after="120"/>
         <w:ind w:firstLine="0"/>
         <w:rPr>
@@ -2834,7 +2793,6 @@
     <w:p>
       <w:pPr>
         <w:pStyle w:val="Heading2"/>
-        <w:keepNext/>
         <w:rPr>
           <w:color w:val="auto"/>
         </w:rPr>
@@ -2845,7 +2803,6 @@
     </w:p>
     <w:p>
       <w:pPr>
-        <w:keepNext w:val="0"/>
         <w:rPr>
           <w:color w:val="auto"/>
         </w:rPr>
@@ -2857,7 +2814,6 @@
     <w:p>
       <w:pPr>
         <w:pStyle w:val="Caption"/>
-        <w:keepNext/>
         <w:rPr>
           <w:color w:val="auto"/>
         </w:rPr>
@@ -2986,7 +2942,6 @@
             <w:pPr>
               <w:spacing w:after="0"/>
             </w:pPr>
-            <w:r/>
           </w:p>
         </w:tc>
       </w:tr>
@@ -3090,7 +3045,6 @@
             <w:pPr>
               <w:spacing w:after="0"/>
             </w:pPr>
-            <w:r/>
           </w:p>
         </w:tc>
       </w:tr>
@@ -3199,7 +3153,6 @@
             <w:pPr>
               <w:spacing w:after="0"/>
             </w:pPr>
-            <w:r/>
           </w:p>
         </w:tc>
       </w:tr>
@@ -3303,14 +3256,12 @@
             <w:pPr>
               <w:spacing w:after="0"/>
             </w:pPr>
-            <w:r/>
           </w:p>
         </w:tc>
       </w:tr>
     </w:tbl>
     <w:p>
       <w:pPr>
-        <w:keepNext w:val="0"/>
         <w:rPr>
           <w:color w:val="auto"/>
         </w:rPr>
@@ -3322,18 +3273,17 @@
     <w:p>
       <w:pPr>
         <w:pStyle w:val="Heading2"/>
-        <w:keepNext/>
         <w:rPr>
           <w:color w:val="auto"/>
         </w:rPr>
       </w:pPr>
       <w:r>
+        <w:lastRenderedPageBreak/>
         <w:t>3.3 Estados históricos e reprodução não controlável</w:t>
       </w:r>
     </w:p>
     <w:p>
       <w:pPr>
-        <w:keepNext w:val="0"/>
         <w:rPr>
           <w:color w:val="auto"/>
         </w:rPr>
@@ -3345,7 +3295,6 @@
     <w:p>
       <w:pPr>
         <w:pStyle w:val="Caption"/>
-        <w:keepNext/>
         <w:rPr>
           <w:color w:val="auto"/>
         </w:rPr>
@@ -3366,6 +3315,7 @@
         <w:gridCol w:w="2835"/>
         <w:gridCol w:w="1587"/>
         <w:gridCol w:w="4706"/>
+        <w:gridCol w:w="360"/>
       </w:tblGrid>
       <w:tr>
         <w:trPr>
@@ -3436,6 +3386,9 @@
           </w:p>
         </w:tc>
         <w:tc>
+          <w:tcPr>
+            <w:tcW w:w="360" w:type="dxa"/>
+          </w:tcPr>
           <w:p>
             <w:pPr>
               <w:spacing w:after="0"/>
@@ -3512,6 +3465,9 @@
           </w:p>
         </w:tc>
         <w:tc>
+          <w:tcPr>
+            <w:tcW w:w="360" w:type="dxa"/>
+          </w:tcPr>
           <w:p>
             <w:pPr>
               <w:spacing w:after="0"/>
@@ -3591,6 +3547,9 @@
           </w:p>
         </w:tc>
         <w:tc>
+          <w:tcPr>
+            <w:tcW w:w="360" w:type="dxa"/>
+          </w:tcPr>
           <w:p>
             <w:pPr>
               <w:spacing w:after="0"/>
@@ -3622,6 +3581,7 @@
               <w:spacing w:after="0"/>
             </w:pPr>
             <w:r>
+              <w:lastRenderedPageBreak/>
               <w:t>Ordem reversa</w:t>
             </w:r>
           </w:p>
@@ -3667,6 +3627,9 @@
           </w:p>
         </w:tc>
         <w:tc>
+          <w:tcPr>
+            <w:tcW w:w="360" w:type="dxa"/>
+          </w:tcPr>
           <w:p>
             <w:pPr>
               <w:spacing w:after="0"/>
@@ -3746,6 +3709,9 @@
           </w:p>
         </w:tc>
         <w:tc>
+          <w:tcPr>
+            <w:tcW w:w="360" w:type="dxa"/>
+          </w:tcPr>
           <w:p>
             <w:pPr>
               <w:spacing w:after="0"/>
@@ -3822,6 +3788,9 @@
           </w:p>
         </w:tc>
         <w:tc>
+          <w:tcPr>
+            <w:tcW w:w="360" w:type="dxa"/>
+          </w:tcPr>
           <w:p>
             <w:pPr>
               <w:spacing w:after="0"/>
@@ -3833,22 +3802,26 @@
         </w:tc>
       </w:tr>
       <w:tr>
+        <w:trPr>
+          <w:jc w:val="center"/>
+        </w:trPr>
         <w:tc>
           <w:tcPr>
-            <w:tcW w:type="dxa" w:w="2835"/>
+            <w:tcW w:w="2835" w:type="dxa"/>
           </w:tcPr>
           <w:p>
             <w:pPr>
               <w:spacing w:after="0"/>
             </w:pPr>
             <w:r>
+              <w:lastRenderedPageBreak/>
               <w:t>batch_size=2048</w:t>
             </w:r>
           </w:p>
         </w:tc>
         <w:tc>
           <w:tcPr>
-            <w:tcW w:type="dxa" w:w="1587"/>
+            <w:tcW w:w="1587" w:type="dxa"/>
           </w:tcPr>
           <w:p>
             <w:pPr>
@@ -3861,7 +3834,7 @@
         </w:tc>
         <w:tc>
           <w:tcPr>
-            <w:tcW w:type="dxa" w:w="4706"/>
+            <w:tcW w:w="4706" w:type="dxa"/>
           </w:tcPr>
           <w:p>
             <w:pPr>
@@ -3873,6 +3846,9 @@
           </w:p>
         </w:tc>
         <w:tc>
+          <w:tcPr>
+            <w:tcW w:w="360" w:type="dxa"/>
+          </w:tcPr>
           <w:p>
             <w:pPr>
               <w:spacing w:after="0"/>
@@ -3884,9 +3860,12 @@
         </w:tc>
       </w:tr>
       <w:tr>
+        <w:trPr>
+          <w:jc w:val="center"/>
+        </w:trPr>
         <w:tc>
           <w:tcPr>
-            <w:tcW w:type="dxa" w:w="2835"/>
+            <w:tcW w:w="2835" w:type="dxa"/>
           </w:tcPr>
           <w:p>
             <w:pPr>
@@ -3899,7 +3878,7 @@
         </w:tc>
         <w:tc>
           <w:tcPr>
-            <w:tcW w:type="dxa" w:w="1587"/>
+            <w:tcW w:w="1587" w:type="dxa"/>
           </w:tcPr>
           <w:p>
             <w:pPr>
@@ -3912,7 +3891,7 @@
         </w:tc>
         <w:tc>
           <w:tcPr>
-            <w:tcW w:type="dxa" w:w="4706"/>
+            <w:tcW w:w="4706" w:type="dxa"/>
           </w:tcPr>
           <w:p>
             <w:pPr>
@@ -3924,6 +3903,9 @@
           </w:p>
         </w:tc>
         <w:tc>
+          <w:tcPr>
+            <w:tcW w:w="360" w:type="dxa"/>
+          </w:tcPr>
           <w:p>
             <w:pPr>
               <w:spacing w:after="0"/>
@@ -3935,9 +3917,12 @@
         </w:tc>
       </w:tr>
       <w:tr>
+        <w:trPr>
+          <w:jc w:val="center"/>
+        </w:trPr>
         <w:tc>
           <w:tcPr>
-            <w:tcW w:type="dxa" w:w="2835"/>
+            <w:tcW w:w="2835" w:type="dxa"/>
           </w:tcPr>
           <w:p>
             <w:pPr>
@@ -3950,7 +3935,7 @@
         </w:tc>
         <w:tc>
           <w:tcPr>
-            <w:tcW w:type="dxa" w:w="1587"/>
+            <w:tcW w:w="1587" w:type="dxa"/>
           </w:tcPr>
           <w:p>
             <w:pPr>
@@ -3963,7 +3948,7 @@
         </w:tc>
         <w:tc>
           <w:tcPr>
-            <w:tcW w:type="dxa" w:w="4706"/>
+            <w:tcW w:w="4706" w:type="dxa"/>
           </w:tcPr>
           <w:p>
             <w:pPr>
@@ -3975,6 +3960,9 @@
           </w:p>
         </w:tc>
         <w:tc>
+          <w:tcPr>
+            <w:tcW w:w="360" w:type="dxa"/>
+          </w:tcPr>
           <w:p>
             <w:pPr>
               <w:spacing w:after="0"/>
@@ -3988,7 +3976,6 @@
     </w:tbl>
     <w:p>
       <w:pPr>
-        <w:keepNext w:val="0"/>
         <w:spacing w:before="60" w:after="120"/>
         <w:ind w:firstLine="0"/>
         <w:rPr>
@@ -3996,13 +3983,16 @@
         </w:rPr>
       </w:pPr>
       <w:r>
-        <w:t>A comparação entre estados preservados permanece uma hipótese metodologicamente relevante, mas não é tratada como evidência final de divergência histórica enquanto não houver estado histórico completo e verificável. A revisão não seleciona retrospectivamente as métricas mais favoráveis disponíveis.</w:t>
+        <w:t xml:space="preserve">A comparação entre estados preservados permanece uma hipótese metodologicamente relevante, mas não é tratada como evidência final de divergência histórica enquanto não houver estado histórico </w:t>
+      </w:r>
+      <w:r>
+        <w:lastRenderedPageBreak/>
+        <w:t>completo e verificável. A revisão não seleciona retrospectivamente as métricas mais favoráveis disponíveis.</w:t>
       </w:r>
     </w:p>
     <w:p>
       <w:pPr>
         <w:pStyle w:val="Heading2"/>
-        <w:keepNext/>
         <w:rPr>
           <w:color w:val="auto"/>
         </w:rPr>
@@ -4013,7 +4003,6 @@
     </w:p>
     <w:p>
       <w:pPr>
-        <w:keepNext w:val="0"/>
         <w:rPr>
           <w:color w:val="auto"/>
         </w:rPr>
@@ -4025,7 +4014,6 @@
     <w:p>
       <w:pPr>
         <w:pStyle w:val="Heading2"/>
-        <w:keepNext/>
         <w:rPr>
           <w:color w:val="auto"/>
         </w:rPr>
@@ -4037,7 +4025,6 @@
     <w:p>
       <w:pPr>
         <w:pStyle w:val="Caption"/>
-        <w:keepNext/>
         <w:rPr>
           <w:color w:val="auto"/>
         </w:rPr>
@@ -4059,6 +4046,8 @@
         <w:gridCol w:w="1587"/>
         <w:gridCol w:w="1531"/>
         <w:gridCol w:w="3402"/>
+        <w:gridCol w:w="360"/>
+        <w:gridCol w:w="360"/>
       </w:tblGrid>
       <w:tr>
         <w:trPr>
@@ -4150,6 +4139,9 @@
           </w:p>
         </w:tc>
         <w:tc>
+          <w:tcPr>
+            <w:tcW w:w="360" w:type="dxa"/>
+          </w:tcPr>
           <w:p>
             <w:pPr>
               <w:spacing w:after="0"/>
@@ -4160,6 +4152,9 @@
           </w:p>
         </w:tc>
         <w:tc>
+          <w:tcPr>
+            <w:tcW w:w="360" w:type="dxa"/>
+          </w:tcPr>
           <w:p>
             <w:pPr>
               <w:spacing w:after="0"/>
@@ -4256,6 +4251,9 @@
           </w:p>
         </w:tc>
         <w:tc>
+          <w:tcPr>
+            <w:tcW w:w="360" w:type="dxa"/>
+          </w:tcPr>
           <w:p>
             <w:pPr>
               <w:spacing w:after="0"/>
@@ -4266,6 +4264,9 @@
           </w:p>
         </w:tc>
         <w:tc>
+          <w:tcPr>
+            <w:tcW w:w="360" w:type="dxa"/>
+          </w:tcPr>
           <w:p>
             <w:pPr>
               <w:spacing w:after="0"/>
@@ -4366,6 +4367,9 @@
           </w:p>
         </w:tc>
         <w:tc>
+          <w:tcPr>
+            <w:tcW w:w="360" w:type="dxa"/>
+          </w:tcPr>
           <w:p>
             <w:pPr>
               <w:spacing w:after="0"/>
@@ -4376,6 +4380,9 @@
           </w:p>
         </w:tc>
         <w:tc>
+          <w:tcPr>
+            <w:tcW w:w="360" w:type="dxa"/>
+          </w:tcPr>
           <w:p>
             <w:pPr>
               <w:spacing w:after="0"/>
@@ -4408,6 +4415,7 @@
               <w:spacing w:after="0"/>
             </w:pPr>
             <w:r>
+              <w:lastRenderedPageBreak/>
               <w:t>2</w:t>
             </w:r>
           </w:p>
@@ -4476,6 +4484,9 @@
           </w:p>
         </w:tc>
         <w:tc>
+          <w:tcPr>
+            <w:tcW w:w="360" w:type="dxa"/>
+          </w:tcPr>
           <w:p>
             <w:pPr>
               <w:spacing w:after="0"/>
@@ -4486,6 +4497,9 @@
           </w:p>
         </w:tc>
         <w:tc>
+          <w:tcPr>
+            <w:tcW w:w="360" w:type="dxa"/>
+          </w:tcPr>
           <w:p>
             <w:pPr>
               <w:spacing w:after="0"/>
@@ -4582,6 +4596,9 @@
           </w:p>
         </w:tc>
         <w:tc>
+          <w:tcPr>
+            <w:tcW w:w="360" w:type="dxa"/>
+          </w:tcPr>
           <w:p>
             <w:pPr>
               <w:spacing w:after="0"/>
@@ -4592,6 +4609,9 @@
           </w:p>
         </w:tc>
         <w:tc>
+          <w:tcPr>
+            <w:tcW w:w="360" w:type="dxa"/>
+          </w:tcPr>
           <w:p>
             <w:pPr>
               <w:spacing w:after="0"/>
@@ -4603,9 +4623,12 @@
         </w:tc>
       </w:tr>
       <w:tr>
+        <w:trPr>
+          <w:jc w:val="center"/>
+        </w:trPr>
         <w:tc>
           <w:tcPr>
-            <w:tcW w:type="dxa" w:w="2608"/>
+            <w:tcW w:w="2608" w:type="dxa"/>
           </w:tcPr>
           <w:p>
             <w:pPr>
@@ -4618,7 +4641,7 @@
         </w:tc>
         <w:tc>
           <w:tcPr>
-            <w:tcW w:type="dxa" w:w="1587"/>
+            <w:tcW w:w="1587" w:type="dxa"/>
           </w:tcPr>
           <w:p>
             <w:pPr>
@@ -4631,7 +4654,7 @@
         </w:tc>
         <w:tc>
           <w:tcPr>
-            <w:tcW w:type="dxa" w:w="1531"/>
+            <w:tcW w:w="1531" w:type="dxa"/>
           </w:tcPr>
           <w:p>
             <w:pPr>
@@ -4644,7 +4667,7 @@
         </w:tc>
         <w:tc>
           <w:tcPr>
-            <w:tcW w:type="dxa" w:w="3402"/>
+            <w:tcW w:w="3402" w:type="dxa"/>
           </w:tcPr>
           <w:p>
             <w:pPr>
@@ -4656,6 +4679,9 @@
           </w:p>
         </w:tc>
         <w:tc>
+          <w:tcPr>
+            <w:tcW w:w="360" w:type="dxa"/>
+          </w:tcPr>
           <w:p>
             <w:pPr>
               <w:spacing w:after="0"/>
@@ -4666,6 +4692,9 @@
           </w:p>
         </w:tc>
         <w:tc>
+          <w:tcPr>
+            <w:tcW w:w="360" w:type="dxa"/>
+          </w:tcPr>
           <w:p>
             <w:pPr>
               <w:spacing w:after="0"/>
@@ -4677,9 +4706,12 @@
         </w:tc>
       </w:tr>
       <w:tr>
+        <w:trPr>
+          <w:jc w:val="center"/>
+        </w:trPr>
         <w:tc>
           <w:tcPr>
-            <w:tcW w:type="dxa" w:w="2608"/>
+            <w:tcW w:w="2608" w:type="dxa"/>
           </w:tcPr>
           <w:p>
             <w:pPr>
@@ -4692,7 +4724,7 @@
         </w:tc>
         <w:tc>
           <w:tcPr>
-            <w:tcW w:type="dxa" w:w="1587"/>
+            <w:tcW w:w="1587" w:type="dxa"/>
           </w:tcPr>
           <w:p>
             <w:pPr>
@@ -4705,7 +4737,7 @@
         </w:tc>
         <w:tc>
           <w:tcPr>
-            <w:tcW w:type="dxa" w:w="1531"/>
+            <w:tcW w:w="1531" w:type="dxa"/>
           </w:tcPr>
           <w:p>
             <w:pPr>
@@ -4718,7 +4750,7 @@
         </w:tc>
         <w:tc>
           <w:tcPr>
-            <w:tcW w:type="dxa" w:w="3402"/>
+            <w:tcW w:w="3402" w:type="dxa"/>
           </w:tcPr>
           <w:p>
             <w:pPr>
@@ -4730,6 +4762,9 @@
           </w:p>
         </w:tc>
         <w:tc>
+          <w:tcPr>
+            <w:tcW w:w="360" w:type="dxa"/>
+          </w:tcPr>
           <w:p>
             <w:pPr>
               <w:spacing w:after="0"/>
@@ -4740,6 +4775,9 @@
           </w:p>
         </w:tc>
         <w:tc>
+          <w:tcPr>
+            <w:tcW w:w="360" w:type="dxa"/>
+          </w:tcPr>
           <w:p>
             <w:pPr>
               <w:spacing w:after="0"/>
@@ -4753,7 +4791,6 @@
     </w:tbl>
     <w:p>
       <w:pPr>
-        <w:keepNext w:val="0"/>
         <w:spacing w:before="60" w:after="120"/>
         <w:ind w:firstLine="0"/>
         <w:rPr>
@@ -4766,19 +4803,18 @@
     </w:p>
     <w:p>
       <w:pPr>
-        <w:keepNext w:val="0"/>
         <w:rPr>
           <w:color w:val="auto"/>
         </w:rPr>
       </w:pPr>
       <w:r>
+        <w:lastRenderedPageBreak/>
         <w:t>O diagnóstico de todos os registros é mantido apenas para explicar a circularidade avaliativa: um escore de centroide derivado da mesma geometria que constrói o alvo pode recuperar esse alvo artificialmente bem. O resultado confirmatório é o cross-fitting por grupos, que evita o ajuste do agrupamento, do alvo e do centroide sobre os registros de teste, sem converter o rótulo sintético em construto externo.</w:t>
       </w:r>
     </w:p>
     <w:p>
       <w:pPr>
         <w:pStyle w:val="Heading1"/>
-        <w:keepNext/>
         <w:rPr>
           <w:color w:val="auto"/>
         </w:rPr>
@@ -4793,7 +4829,6 @@
     <w:p>
       <w:pPr>
         <w:pStyle w:val="Heading2"/>
-        <w:keepNext/>
         <w:rPr>
           <w:color w:val="auto"/>
         </w:rPr>
@@ -4807,7 +4842,6 @@
     </w:p>
     <w:p>
       <w:pPr>
-        <w:keepNext w:val="0"/>
         <w:rPr>
           <w:color w:val="auto"/>
         </w:rPr>
@@ -4819,7 +4853,6 @@
     <w:p>
       <w:pPr>
         <w:pStyle w:val="Heading2"/>
-        <w:keepNext/>
         <w:rPr>
           <w:color w:val="auto"/>
         </w:rPr>
@@ -4833,7 +4866,6 @@
     </w:p>
     <w:p>
       <w:pPr>
-        <w:keepNext w:val="0"/>
         <w:rPr>
           <w:color w:val="auto"/>
         </w:rPr>
@@ -4845,7 +4877,6 @@
     <w:p>
       <w:pPr>
         <w:pStyle w:val="Heading2"/>
-        <w:keepNext/>
         <w:rPr>
           <w:color w:val="auto"/>
         </w:rPr>
@@ -4856,7 +4887,6 @@
     </w:p>
     <w:p>
       <w:pPr>
-        <w:keepNext w:val="0"/>
         <w:rPr>
           <w:color w:val="auto"/>
         </w:rPr>
@@ -4868,7 +4898,6 @@
     <w:p>
       <w:pPr>
         <w:pStyle w:val="Heading2"/>
-        <w:keepNext/>
         <w:rPr>
           <w:color w:val="auto"/>
         </w:rPr>
@@ -4879,7 +4908,6 @@
     </w:p>
     <w:p>
       <w:pPr>
-        <w:keepNext w:val="0"/>
         <w:rPr>
           <w:color w:val="auto"/>
         </w:rPr>
@@ -4891,7 +4919,6 @@
     <w:p>
       <w:pPr>
         <w:pStyle w:val="Heading2"/>
-        <w:keepNext/>
         <w:rPr>
           <w:color w:val="auto"/>
         </w:rPr>
@@ -4905,7 +4932,6 @@
     </w:p>
     <w:p>
       <w:pPr>
-        <w:keepNext w:val="0"/>
         <w:rPr>
           <w:color w:val="auto"/>
         </w:rPr>
@@ -4917,7 +4943,6 @@
     <w:p>
       <w:pPr>
         <w:pStyle w:val="Heading2"/>
-        <w:keepNext/>
         <w:rPr>
           <w:color w:val="auto"/>
         </w:rPr>
@@ -4926,12 +4951,12 @@
         <w:rPr>
           <w:color w:val="auto"/>
         </w:rPr>
+        <w:lastRenderedPageBreak/>
         <w:t>4.6 Resultado negativo como contribuição científica</w:t>
       </w:r>
     </w:p>
     <w:p>
       <w:pPr>
-        <w:keepNext w:val="0"/>
         <w:rPr>
           <w:color w:val="auto"/>
         </w:rPr>
@@ -4943,7 +4968,6 @@
     <w:p>
       <w:pPr>
         <w:pStyle w:val="Heading1"/>
-        <w:keepNext/>
         <w:rPr>
           <w:color w:val="auto"/>
         </w:rPr>
@@ -4957,7 +4981,6 @@
     </w:p>
     <w:p>
       <w:pPr>
-        <w:keepNext w:val="0"/>
         <w:rPr>
           <w:color w:val="auto"/>
         </w:rPr>
@@ -4968,7 +4991,6 @@
     </w:p>
     <w:p>
       <w:pPr>
-        <w:keepNext w:val="0"/>
         <w:rPr>
           <w:color w:val="auto"/>
         </w:rPr>
@@ -4980,7 +5002,6 @@
     <w:p>
       <w:pPr>
         <w:pStyle w:val="Heading1"/>
-        <w:keepNext/>
         <w:rPr>
           <w:color w:val="auto"/>
         </w:rPr>
@@ -4994,7 +5015,6 @@
     </w:p>
     <w:p>
       <w:pPr>
-        <w:keepNext w:val="0"/>
         <w:rPr>
           <w:color w:val="auto"/>
         </w:rPr>
@@ -5006,7 +5026,6 @@
     <w:p>
       <w:pPr>
         <w:pStyle w:val="Heading1"/>
-        <w:keepNext/>
         <w:rPr>
           <w:color w:val="auto"/>
         </w:rPr>
@@ -5020,7 +5039,6 @@
     </w:p>
     <w:p>
       <w:pPr>
-        <w:keepNext w:val="0"/>
         <w:ind w:firstLine="0"/>
         <w:jc w:val="left"/>
         <w:rPr>
@@ -5033,7 +5051,6 @@
     </w:p>
     <w:p>
       <w:pPr>
-        <w:keepNext w:val="0"/>
         <w:ind w:firstLine="0"/>
         <w:rPr>
           <w:color w:val="auto"/>
@@ -5045,19 +5062,18 @@
     </w:p>
     <w:p>
       <w:pPr>
-        <w:keepNext w:val="0"/>
         <w:ind w:firstLine="0"/>
         <w:rPr>
           <w:color w:val="auto"/>
         </w:rPr>
       </w:pPr>
       <w:r>
+        <w:lastRenderedPageBreak/>
         <w:t>Conflitos de interesse. O autor desenvolveu o repositório auditado; esse conflito intelectual é declarado. Não foi localizada declaração documental verificável sobre conflitos financeiros adicionais; a informação deverá ser confirmada pelo autor antes de submissão.</w:t>
       </w:r>
     </w:p>
     <w:p>
       <w:pPr>
-        <w:keepNext w:val="0"/>
         <w:ind w:firstLine="0"/>
         <w:rPr>
           <w:color w:val="auto"/>
@@ -5073,7 +5089,6 @@
     </w:p>
     <w:p>
       <w:pPr>
-        <w:keepNext w:val="0"/>
         <w:ind w:firstLine="0"/>
         <w:rPr>
           <w:color w:val="auto"/>
@@ -5084,7 +5099,6 @@
       </w:r>
     </w:p>
     <w:p>
-      <w:pPr/>
       <w:r>
         <w:t>Uso de inteligência artificial na pesquisa e redação. A declaração específica deve ser confirmada pelo autor de acordo com a política do periódico; esta revisão editorial e metodológica não substitui essa declaração.</w:t>
       </w:r>
@@ -5092,7 +5106,6 @@
     <w:p>
       <w:pPr>
         <w:pStyle w:val="Heading1"/>
-        <w:keepNext/>
         <w:rPr>
           <w:color w:val="auto"/>
         </w:rPr>
@@ -5107,7 +5120,6 @@
     <w:p>
       <w:pPr>
         <w:pStyle w:val="Referncia"/>
-        <w:keepNext w:val="0"/>
         <w:spacing w:line="252" w:lineRule="auto"/>
       </w:pPr>
       <w:r>
@@ -5116,7 +5128,7 @@
         </w:rPr>
         <w:t xml:space="preserve">BENDER, E. M.; FRIEDMAN, B. Data statements for natural language processing: toward mitigating system bias and enabling better science. Transactions of the Association for Computational Linguistics, v. 6, p. 587–604, 2018. DOI: 10.1162/tacl_a_00041. Disponível em: </w:t>
       </w:r>
-      <w:hyperlink r:id="rId14">
+      <w:hyperlink r:id="rId10">
         <w:r>
           <w:rPr>
             <w:u w:val="single"/>
@@ -5134,7 +5146,6 @@
     <w:p>
       <w:pPr>
         <w:pStyle w:val="Referncia"/>
-        <w:keepNext w:val="0"/>
         <w:spacing w:line="252" w:lineRule="auto"/>
       </w:pPr>
       <w:r>
@@ -5143,7 +5154,7 @@
         </w:rPr>
         <w:t xml:space="preserve">BUOLAMWINI, J.; GEBRU, T. Gender Shades: intersectional accuracy disparities in commercial gender classification. Proceedings of Machine Learning Research, v. 81, p. 77–91, 2018. Disponível em: </w:t>
       </w:r>
-      <w:hyperlink r:id="rId15">
+      <w:hyperlink r:id="rId11">
         <w:r>
           <w:rPr>
             <w:u w:val="single"/>
@@ -5161,7 +5172,6 @@
     <w:p>
       <w:pPr>
         <w:pStyle w:val="Referncia"/>
-        <w:keepNext w:val="0"/>
         <w:spacing w:line="252" w:lineRule="auto"/>
       </w:pPr>
       <w:r>
@@ -5170,7 +5180,7 @@
         </w:rPr>
         <w:t xml:space="preserve">CONSELHO NACIONAL DE JUSTIÇA; PROGRAMA DAS NAÇÕES UNIDAS PARA O DESENVOLVIMENTO. Caderno temático de relações raciais: diretrizes gerais para atuação dos serviços penais. Brasília, DF: CNJ, 2024. Disponível em: </w:t>
       </w:r>
-      <w:hyperlink r:id="rId16">
+      <w:hyperlink r:id="rId12">
         <w:r>
           <w:rPr>
             <w:u w:val="single"/>
@@ -5188,7 +5198,6 @@
     <w:p>
       <w:pPr>
         <w:pStyle w:val="Referncia"/>
-        <w:keepNext w:val="0"/>
         <w:spacing w:line="252" w:lineRule="auto"/>
       </w:pPr>
       <w:r>
@@ -5197,7 +5206,7 @@
         </w:rPr>
         <w:t xml:space="preserve">DENG, J. et al. ArcFace: additive angular margin loss for deep face recognition. In: IEEE/CVF Conference on Computer Vision and Pattern Recognition, 2019. p. 4690–4699. DOI: 10.1109/CVPR.2019.00482. Disponível em: </w:t>
       </w:r>
-      <w:hyperlink r:id="rId17">
+      <w:hyperlink r:id="rId13">
         <w:r>
           <w:rPr>
             <w:u w:val="single"/>
@@ -5215,7 +5224,6 @@
     <w:p>
       <w:pPr>
         <w:pStyle w:val="Referncia"/>
-        <w:keepNext w:val="0"/>
         <w:spacing w:line="252" w:lineRule="auto"/>
       </w:pPr>
       <w:r>
@@ -5224,7 +5232,7 @@
         </w:rPr>
         <w:t xml:space="preserve">ELWERT, F.; WINSHIP, C. Endogenous selection bias: the problem of conditioning on a collider variable. Annual Review of Sociology, v. 40, p. 31–53, 2014. DOI: 10.1146/annurev-soc-071913-043455. Disponível em: </w:t>
       </w:r>
-      <w:hyperlink r:id="rId18">
+      <w:hyperlink r:id="rId14">
         <w:r>
           <w:rPr>
             <w:u w:val="single"/>
@@ -5242,17 +5250,15 @@
     <w:p>
       <w:pPr>
         <w:pStyle w:val="Referncia"/>
-        <w:keepNext w:val="0"/>
         <w:spacing w:line="252" w:lineRule="auto"/>
       </w:pPr>
       <w:r>
         <w:rPr>
           <w:rFonts w:eastAsia="Arial"/>
         </w:rPr>
-        <w:lastRenderedPageBreak/>
         <w:t xml:space="preserve">ENSIGN, D. et al. Runaway feedback loops in predictive policing. Proceedings of Machine Learning Research, v. 81, p. 160–171, 2018. Disponível em: </w:t>
       </w:r>
-      <w:hyperlink r:id="rId19">
+      <w:hyperlink r:id="rId15">
         <w:r>
           <w:rPr>
             <w:u w:val="single"/>
@@ -5270,7 +5276,6 @@
     <w:p>
       <w:pPr>
         <w:pStyle w:val="Referncia"/>
-        <w:keepNext w:val="0"/>
         <w:spacing w:line="252" w:lineRule="auto"/>
       </w:pPr>
       <w:r>
@@ -5279,7 +5284,7 @@
         </w:rPr>
         <w:t xml:space="preserve">FAWCETT, T. An introduction to ROC analysis. Pattern Recognition Letters, v. 27, n. 8, p. 861–874, 2006. DOI: 10.1016/j.patrec.2005.10.010. Disponível em: </w:t>
       </w:r>
-      <w:hyperlink r:id="rId20">
+      <w:hyperlink r:id="rId16">
         <w:r>
           <w:rPr>
             <w:u w:val="single"/>
@@ -5297,7 +5302,6 @@
     <w:p>
       <w:pPr>
         <w:pStyle w:val="Referncia"/>
-        <w:keepNext w:val="0"/>
         <w:spacing w:line="252" w:lineRule="auto"/>
       </w:pPr>
       <w:r>
@@ -5306,7 +5310,7 @@
         </w:rPr>
         <w:t xml:space="preserve">GEBRU, T. et al. Datasheets for datasets. Communications of the ACM, v. 64, n. 12, p. 86–92, 2021. DOI: 10.1145/3458723. Disponível em: </w:t>
       </w:r>
-      <w:hyperlink r:id="rId21">
+      <w:hyperlink r:id="rId17">
         <w:r>
           <w:rPr>
             <w:u w:val="single"/>
@@ -5324,7 +5328,6 @@
     <w:p>
       <w:pPr>
         <w:pStyle w:val="Referncia"/>
-        <w:keepNext w:val="0"/>
         <w:spacing w:line="252" w:lineRule="auto"/>
       </w:pPr>
       <w:r>
@@ -5333,7 +5336,7 @@
         </w:rPr>
         <w:t xml:space="preserve">GROTHER, P.; NGAN, M.; HANAOKA, K. Face Recognition Vendor Test Part 3: demographic effects. NISTIR 8280. Gaithersburg: NIST, 2019. DOI: 10.6028/NIST.IR.8280. Disponível em: </w:t>
       </w:r>
-      <w:hyperlink r:id="rId22">
+      <w:hyperlink r:id="rId18">
         <w:r>
           <w:rPr>
             <w:u w:val="single"/>
@@ -5351,7 +5354,6 @@
     <w:p>
       <w:pPr>
         <w:pStyle w:val="Referncia"/>
-        <w:keepNext w:val="0"/>
         <w:spacing w:line="252" w:lineRule="auto"/>
       </w:pPr>
       <w:r>
@@ -5360,7 +5362,7 @@
         </w:rPr>
         <w:t xml:space="preserve">HERNÁN, M. A.; HERNÁNDEZ-DÍAZ, S.; ROBINS, J. M. A structural approach to selection bias. Epidemiology, v. 15, n. 5, p. 615–625, 2004. DOI: 10.1097/01.ede.0000135174.63482.43. Disponível em: </w:t>
       </w:r>
-      <w:hyperlink r:id="rId23">
+      <w:hyperlink r:id="rId19">
         <w:r>
           <w:rPr>
             <w:u w:val="single"/>
@@ -5378,7 +5380,6 @@
     <w:p>
       <w:pPr>
         <w:pStyle w:val="Referncia"/>
-        <w:keepNext w:val="0"/>
         <w:spacing w:line="252" w:lineRule="auto"/>
       </w:pPr>
       <w:r>
@@ -5387,7 +5388,7 @@
         </w:rPr>
         <w:t xml:space="preserve">HUBERT, L.; ARABIE, P. Comparing partitions. Journal of Classification, v. 2, p. 193–218, 1985. DOI: 10.1007/BF01908075. Disponível em: </w:t>
       </w:r>
-      <w:hyperlink r:id="rId24">
+      <w:hyperlink r:id="rId20">
         <w:r>
           <w:rPr>
             <w:u w:val="single"/>
@@ -5405,7 +5406,6 @@
     <w:p>
       <w:pPr>
         <w:pStyle w:val="Referncia"/>
-        <w:keepNext w:val="0"/>
         <w:spacing w:line="252" w:lineRule="auto"/>
       </w:pPr>
       <w:r>
@@ -5414,7 +5414,7 @@
         </w:rPr>
         <w:t xml:space="preserve">INTERPOL. About Red Notices. Lyon: Interpol, 2026. Disponível em: </w:t>
       </w:r>
-      <w:hyperlink r:id="rId25">
+      <w:hyperlink r:id="rId21">
         <w:r>
           <w:rPr>
             <w:u w:val="single"/>
@@ -5432,7 +5432,6 @@
     <w:p>
       <w:pPr>
         <w:pStyle w:val="Referncia"/>
-        <w:keepNext w:val="0"/>
         <w:spacing w:line="252" w:lineRule="auto"/>
       </w:pPr>
       <w:r>
@@ -5441,7 +5440,7 @@
         </w:rPr>
         <w:t xml:space="preserve">INTERPOL. View Red Notices. Lyon: Interpol, 2026. Disponível em: </w:t>
       </w:r>
-      <w:hyperlink r:id="rId26">
+      <w:hyperlink r:id="rId22">
         <w:r>
           <w:rPr>
             <w:u w:val="single"/>
@@ -5459,7 +5458,6 @@
     <w:p>
       <w:pPr>
         <w:pStyle w:val="Referncia"/>
-        <w:keepNext w:val="0"/>
         <w:spacing w:line="252" w:lineRule="auto"/>
       </w:pPr>
       <w:r>
@@ -5468,7 +5466,7 @@
         </w:rPr>
         <w:t xml:space="preserve">ISO. ISO/IEC 19795-1:2021: information technology — biometric performance testing and reporting — Part 1: principles and framework. Geneva: ISO, 2021. Disponível em: </w:t>
       </w:r>
-      <w:hyperlink r:id="rId27">
+      <w:hyperlink r:id="rId23">
         <w:r>
           <w:rPr>
             <w:u w:val="single"/>
@@ -5486,16 +5484,16 @@
     <w:p>
       <w:pPr>
         <w:pStyle w:val="Referncia"/>
-        <w:keepNext w:val="0"/>
         <w:spacing w:line="252" w:lineRule="auto"/>
       </w:pPr>
       <w:r>
         <w:rPr>
           <w:rFonts w:eastAsia="Arial"/>
         </w:rPr>
+        <w:lastRenderedPageBreak/>
         <w:t xml:space="preserve">ISO. ISO/IEC 19795-10:2024: information technology — biometric performance testing and reporting — Part 10: quantifying biometric system performance variation across demographic groups. Geneva: ISO, 2024. Disponível em: </w:t>
       </w:r>
-      <w:hyperlink r:id="rId28">
+      <w:hyperlink r:id="rId24">
         <w:r>
           <w:rPr>
             <w:u w:val="single"/>
@@ -5513,7 +5511,6 @@
     <w:p>
       <w:pPr>
         <w:pStyle w:val="Referncia"/>
-        <w:keepNext w:val="0"/>
         <w:spacing w:line="252" w:lineRule="auto"/>
       </w:pPr>
       <w:r>
@@ -5522,7 +5519,7 @@
         </w:rPr>
         <w:t xml:space="preserve">JACOBS, A. Z.; WALLACH, H. Measurement and fairness. In: ACM Conference on Fairness, Accountability, and Transparency, 2021. p. 375–385. DOI: 10.1145/3442188.3445901. Disponível em: </w:t>
       </w:r>
-      <w:hyperlink r:id="rId29">
+      <w:hyperlink r:id="rId25">
         <w:r>
           <w:rPr>
             <w:u w:val="single"/>
@@ -5540,7 +5537,6 @@
     <w:p>
       <w:pPr>
         <w:pStyle w:val="Referncia"/>
-        <w:keepNext w:val="0"/>
         <w:spacing w:line="252" w:lineRule="auto"/>
       </w:pPr>
       <w:r>
@@ -5549,7 +5545,7 @@
         </w:rPr>
         <w:t xml:space="preserve">KÄRKKÄINEN, K.; JOO, J. FairFace: face attribute dataset for balanced race, gender, and age for bias measurement and mitigation. In: IEEE/CVF Winter Conference on Applications of Computer Vision, 2021. p. 1548–1558. DOI: 10.1109/WACV48630.2021.00159. Disponível em: </w:t>
       </w:r>
-      <w:hyperlink r:id="rId30">
+      <w:hyperlink r:id="rId26">
         <w:r>
           <w:rPr>
             <w:u w:val="single"/>
@@ -5567,7 +5563,6 @@
     <w:p>
       <w:pPr>
         <w:pStyle w:val="Referncia"/>
-        <w:keepNext w:val="0"/>
         <w:spacing w:line="252" w:lineRule="auto"/>
       </w:pPr>
       <w:r>
@@ -5576,7 +5571,7 @@
         </w:rPr>
         <w:t xml:space="preserve">KAUFMAN, S. et al. Leakage in data mining: formulation, detection, and avoidance. ACM Transactions on Knowledge Discovery from Data, v. 6, n. 4, art. 15, 2012. DOI: 10.1145/2382577.2382579. Disponível em: </w:t>
       </w:r>
-      <w:hyperlink r:id="rId31">
+      <w:hyperlink r:id="rId27">
         <w:r>
           <w:rPr>
             <w:u w:val="single"/>
@@ -5594,7 +5589,6 @@
     <w:p>
       <w:pPr>
         <w:pStyle w:val="Referncia"/>
-        <w:keepNext w:val="0"/>
         <w:spacing w:line="252" w:lineRule="auto"/>
       </w:pPr>
       <w:r>
@@ -5603,7 +5597,7 @@
         </w:rPr>
         <w:t xml:space="preserve">KUHN, H. W. The Hungarian method for the assignment problem. Naval Research Logistics Quarterly, v. 2, n. 1–2, p. 83–97, 1955. DOI: 10.1002/nav.3800020109. Disponível em: </w:t>
       </w:r>
-      <w:hyperlink r:id="rId32">
+      <w:hyperlink r:id="rId28">
         <w:r>
           <w:rPr>
             <w:u w:val="single"/>
@@ -5621,7 +5615,6 @@
     <w:p>
       <w:pPr>
         <w:pStyle w:val="Referncia"/>
-        <w:keepNext w:val="0"/>
         <w:spacing w:line="252" w:lineRule="auto"/>
       </w:pPr>
       <w:r>
@@ -5630,7 +5623,7 @@
         </w:rPr>
         <w:t xml:space="preserve">MITCHELL, M. et al. Model cards for model reporting. In: Conference on Fairness, Accountability, and Transparency, 2019. p. 220–229. DOI: 10.1145/3287560.3287596. Disponível em: </w:t>
       </w:r>
-      <w:hyperlink r:id="rId33">
+      <w:hyperlink r:id="rId29">
         <w:r>
           <w:rPr>
             <w:u w:val="single"/>
@@ -5648,7 +5641,6 @@
     <w:p>
       <w:pPr>
         <w:pStyle w:val="Referncia"/>
-        <w:keepNext w:val="0"/>
         <w:spacing w:line="252" w:lineRule="auto"/>
       </w:pPr>
       <w:r>
@@ -5657,7 +5649,7 @@
         </w:rPr>
         <w:t xml:space="preserve">PEDREGOSA, F. et al. Scikit-learn: machine learning in Python. Journal of Machine Learning Research, v. 12, p. 2825–2830, 2011. Disponível em: </w:t>
       </w:r>
-      <w:hyperlink r:id="rId34">
+      <w:hyperlink r:id="rId30">
         <w:r>
           <w:rPr>
             <w:u w:val="single"/>
@@ -5675,7 +5667,6 @@
     <w:p>
       <w:pPr>
         <w:pStyle w:val="Referncia"/>
-        <w:keepNext w:val="0"/>
         <w:spacing w:line="252" w:lineRule="auto"/>
       </w:pPr>
       <w:r>
@@ -5684,7 +5675,7 @@
         </w:rPr>
         <w:t xml:space="preserve">RAJI, I. D. et al. Closing the AI accountability gap: defining an end-to-end framework for internal algorithmic auditing. In: Conference on Fairness, Accountability, and Transparency, 2020. p. 33–44. DOI: 10.1145/3351095.3372873. Disponível em: </w:t>
       </w:r>
-      <w:hyperlink r:id="rId35">
+      <w:hyperlink r:id="rId31">
         <w:r>
           <w:rPr>
             <w:u w:val="single"/>
@@ -5702,7 +5693,6 @@
     <w:p>
       <w:pPr>
         <w:pStyle w:val="Referncia"/>
-        <w:keepNext w:val="0"/>
         <w:spacing w:line="252" w:lineRule="auto"/>
       </w:pPr>
       <w:r>
@@ -5711,7 +5701,7 @@
         </w:rPr>
         <w:t xml:space="preserve">SANDVE, G. K. et al. Ten simple rules for reproducible computational research. PLOS Computational Biology, v. 9, n. 10, e1003285, 2013. DOI: 10.1371/journal.pcbi.1003285. Disponível em: </w:t>
       </w:r>
-      <w:hyperlink r:id="rId36">
+      <w:hyperlink r:id="rId32">
         <w:r>
           <w:rPr>
             <w:u w:val="single"/>
@@ -5729,7 +5719,6 @@
     <w:p>
       <w:pPr>
         <w:pStyle w:val="Referncia"/>
-        <w:keepNext w:val="0"/>
         <w:spacing w:line="252" w:lineRule="auto"/>
       </w:pPr>
       <w:r>
@@ -5738,7 +5727,7 @@
         </w:rPr>
         <w:t xml:space="preserve">SCHÖLKOPF, B. et al. Estimating the support of a high-dimensional distribution. Neural Computation, v. 13, n. 7, p. 1443–1471, 2001. DOI: 10.1162/089976601750264965. Disponível em: </w:t>
       </w:r>
-      <w:hyperlink r:id="rId37">
+      <w:hyperlink r:id="rId33">
         <w:r>
           <w:rPr>
             <w:u w:val="single"/>
@@ -5756,7 +5745,6 @@
     <w:p>
       <w:pPr>
         <w:pStyle w:val="Referncia"/>
-        <w:keepNext w:val="0"/>
         <w:spacing w:line="252" w:lineRule="auto"/>
       </w:pPr>
       <w:r>
@@ -5765,7 +5753,7 @@
         </w:rPr>
         <w:t xml:space="preserve">SECRETARIA NACIONAL DE POLÍTICAS PENAIS. Relatório de Informações Penais: 14º ciclo SISDEPEN, 2º semestre de 2023. Brasília, DF: SENAPPEN, 2024. Disponível em: </w:t>
       </w:r>
-      <w:hyperlink r:id="rId38">
+      <w:hyperlink r:id="rId34">
         <w:r>
           <w:rPr>
             <w:u w:val="single"/>
@@ -5783,17 +5771,15 @@
     <w:p>
       <w:pPr>
         <w:pStyle w:val="Referncia"/>
-        <w:keepNext w:val="0"/>
         <w:spacing w:line="252" w:lineRule="auto"/>
       </w:pPr>
       <w:r>
         <w:rPr>
           <w:rFonts w:eastAsia="Arial"/>
         </w:rPr>
-        <w:lastRenderedPageBreak/>
         <w:t xml:space="preserve">SURESH, H.; GUTTAG, J. A framework for understanding sources of harm throughout the machine learning life cycle. In: Equity and Access in Algorithms, Mechanisms, and Optimization, 2021. p. 1–9. DOI: 10.1145/3465416.3483305. Disponível em: </w:t>
       </w:r>
-      <w:hyperlink r:id="rId39">
+      <w:hyperlink r:id="rId35">
         <w:r>
           <w:rPr>
             <w:u w:val="single"/>
@@ -5811,7 +5797,6 @@
     <w:p>
       <w:pPr>
         <w:pStyle w:val="Referncia"/>
-        <w:keepNext w:val="0"/>
         <w:spacing w:line="252" w:lineRule="auto"/>
       </w:pPr>
       <w:r>
@@ -5820,7 +5805,7 @@
         </w:rPr>
         <w:t xml:space="preserve">VINH, N. X.; EPPS, J.; BAILEY, J. Information theoretic measures for clusterings comparison: variants, properties, normalization and correction for chance. Journal of Machine Learning Research, v. 11, p. 2837–2854, 2010. Disponível em: </w:t>
       </w:r>
-      <w:hyperlink r:id="rId40">
+      <w:hyperlink r:id="rId36">
         <w:r>
           <w:rPr>
             <w:u w:val="single"/>
@@ -5837,7 +5822,6 @@
     </w:p>
     <w:p>
       <w:pPr>
-        <w:keepNext w:val="0"/>
         <w:rPr>
           <w:color w:val="auto"/>
         </w:rPr>
@@ -5850,10 +5834,10 @@
       </w:r>
     </w:p>
     <w:sectPr>
-      <w:headerReference w:type="default" r:id="rId43"/>
-      <w:footerReference w:type="default" r:id="rId44"/>
-      <w:pgSz w:w="16838" w:h="11906" w:orient="landscape"/>
-      <w:pgMar w:top="1191" w:right="1134" w:bottom="1134" w:left="1304" w:header="454" w:footer="454" w:gutter="0"/>
+      <w:headerReference w:type="default" r:id="rId37"/>
+      <w:footerReference w:type="default" r:id="rId38"/>
+      <w:pgSz w:w="11906" w:h="16838"/>
+      <w:pgMar w:top="1134" w:right="1134" w:bottom="1304" w:left="1191" w:header="454" w:footer="454" w:gutter="0"/>
       <w:cols w:space="720"/>
       <w:docGrid w:linePitch="360"/>
     </w:sectPr>
@@ -5951,85 +5935,6 @@
         <w:color w:val="5B6573"/>
         <w:sz w:val="16"/>
       </w:rPr>
-      <w:t>1</w:t>
-    </w:r>
-    <w:r>
-      <w:rPr>
-        <w:rFonts w:eastAsia="Arial"/>
-        <w:color w:val="5B6573"/>
-        <w:sz w:val="16"/>
-      </w:rPr>
-      <w:fldChar w:fldCharType="end"/>
-    </w:r>
-  </w:p>
-</w:ftr>
-</file>
-
-<file path=word/footer2.xml><?xml version="1.0" encoding="utf-8"?>
-<w:ftr xmlns:wpc="http://schemas.microsoft.com/office/word/2010/wordprocessingCanvas" xmlns:cx="http://schemas.microsoft.com/office/drawing/2014/chartex" xmlns:cx1="http://schemas.microsoft.com/office/drawing/2015/9/8/chartex" xmlns:cx2="http://schemas.microsoft.com/office/drawing/2015/10/21/chartex" xmlns:cx3="http://schemas.microsoft.com/office/drawing/2016/5/9/chartex" xmlns:cx4="http://schemas.microsoft.com/office/drawing/2016/5/10/chartex" xmlns:cx5="http://schemas.microsoft.com/office/drawing/2016/5/11/chartex" xmlns:cx6="http://schemas.microsoft.com/office/drawing/2016/5/12/chartex" xmlns:cx7="http://schemas.microsoft.com/office/drawing/2016/5/13/chartex" xmlns:cx8="http://schemas.microsoft.com/office/drawing/2016/5/14/chartex" xmlns:mc="http://schemas.openxmlformats.org/markup-compatibility/2006" xmlns:aink="http://schemas.microsoft.com/office/drawing/2016/ink" xmlns:am3d="http://schemas.microsoft.com/office/drawing/2017/model3d" xmlns:o="urn:schemas-microsoft-com:office:office" xmlns:oel="http://schemas.microsoft.com/office/2019/extlst" xmlns:r="http://schemas.openxmlformats.org/officeDocument/2006/relationships" xmlns:m="http://schemas.openxmlformats.org/officeDocument/2006/math" xmlns:v="urn:schemas-microsoft-com:vml" xmlns:wp14="http://schemas.microsoft.com/office/word/2010/wordprocessingDrawing" xmlns:wp="http://schemas.openxmlformats.org/drawingml/2006/wordprocessingDrawing" xmlns:w10="urn:schemas-microsoft-com:office:word" xmlns:w="http://schemas.openxmlformats.org/wordprocessingml/2006/main" xmlns:w14="http://schemas.microsoft.com/office/word/2010/wordml" xmlns:w15="http://schemas.microsoft.com/office/word/2012/wordml" xmlns:w16cex="http://schemas.microsoft.com/office/word/2018/wordml/cex" xmlns:w16cid="http://schemas.microsoft.com/office/word/2016/wordml/cid" xmlns:w16="http://schemas.microsoft.com/office/word/2018/wordml" xmlns:w16du="http://schemas.microsoft.com/office/word/2023/wordml/word16du" xmlns:w16sdtdh="http://schemas.microsoft.com/office/word/2020/wordml/sdtdatahash" xmlns:w16sdtfl="http://schemas.microsoft.com/office/word/2024/wordml/sdtformatlock" xmlns:w16se="http://schemas.microsoft.com/office/word/2015/wordml/symex" xmlns:wpg="http://schemas.microsoft.com/office/word/2010/wordprocessingGroup" xmlns:wpi="http://schemas.microsoft.com/office/word/2010/wordprocessingInk" xmlns:wne="http://schemas.microsoft.com/office/word/2006/wordml" xmlns:wps="http://schemas.microsoft.com/office/word/2010/wordprocessingShape" mc:Ignorable="w14 w15 w16se w16cid w16 w16cex w16sdtdh w16sdtfl w16du wp14">
-  <w:p>
-    <w:pPr>
-      <w:pStyle w:val="Footer"/>
-      <w:ind w:firstLine="0"/>
-      <w:jc w:val="right"/>
-    </w:pPr>
-    <w:r>
-      <w:rPr>
-        <w:rFonts w:eastAsia="Arial"/>
-        <w:color w:val="5B6573"/>
-        <w:sz w:val="16"/>
-      </w:rPr>
-      <w:t xml:space="preserve">Gusmão, </w:t>
-    </w:r>
-    <w:proofErr w:type="gramStart"/>
-    <w:r>
-      <w:rPr>
-        <w:rFonts w:eastAsia="Arial"/>
-        <w:color w:val="5B6573"/>
-        <w:sz w:val="16"/>
-      </w:rPr>
-      <w:t>2026  |</w:t>
-    </w:r>
-    <w:proofErr w:type="gramEnd"/>
-    <w:r>
-      <w:rPr>
-        <w:rFonts w:eastAsia="Arial"/>
-        <w:color w:val="5B6573"/>
-        <w:sz w:val="16"/>
-      </w:rPr>
-      <w:t xml:space="preserve">  </w:t>
-    </w:r>
-    <w:r>
-      <w:rPr>
-        <w:rFonts w:eastAsia="Arial"/>
-        <w:color w:val="5B6573"/>
-        <w:sz w:val="16"/>
-      </w:rPr>
-      <w:fldChar w:fldCharType="begin"/>
-    </w:r>
-    <w:r>
-      <w:rPr>
-        <w:rFonts w:eastAsia="Arial"/>
-        <w:color w:val="5B6573"/>
-        <w:sz w:val="16"/>
-      </w:rPr>
-      <w:instrText xml:space="preserve"> PAGE </w:instrText>
-    </w:r>
-    <w:r>
-      <w:rPr>
-        <w:rFonts w:eastAsia="Arial"/>
-        <w:color w:val="5B6573"/>
-        <w:sz w:val="16"/>
-      </w:rPr>
-      <w:fldChar w:fldCharType="separate"/>
-    </w:r>
-    <w:r>
-      <w:rPr>
-        <w:rFonts w:eastAsia="Arial"/>
-        <w:noProof/>
-        <w:color w:val="5B6573"/>
-        <w:sz w:val="16"/>
-      </w:rPr>
       <w:t>14</w:t>
     </w:r>
     <w:r>
@@ -6070,18 +5975,6 @@
 </file>
 
 <file path=word/header1.xml><?xml version="1.0" encoding="utf-8"?>
-<w:hdr xmlns:wpc="http://schemas.microsoft.com/office/word/2010/wordprocessingCanvas" xmlns:cx="http://schemas.microsoft.com/office/drawing/2014/chartex" xmlns:cx1="http://schemas.microsoft.com/office/drawing/2015/9/8/chartex" xmlns:cx2="http://schemas.microsoft.com/office/drawing/2015/10/21/chartex" xmlns:cx3="http://schemas.microsoft.com/office/drawing/2016/5/9/chartex" xmlns:cx4="http://schemas.microsoft.com/office/drawing/2016/5/10/chartex" xmlns:cx5="http://schemas.microsoft.com/office/drawing/2016/5/11/chartex" xmlns:cx6="http://schemas.microsoft.com/office/drawing/2016/5/12/chartex" xmlns:cx7="http://schemas.microsoft.com/office/drawing/2016/5/13/chartex" xmlns:cx8="http://schemas.microsoft.com/office/drawing/2016/5/14/chartex" xmlns:mc="http://schemas.openxmlformats.org/markup-compatibility/2006" xmlns:aink="http://schemas.microsoft.com/office/drawing/2016/ink" xmlns:am3d="http://schemas.microsoft.com/office/drawing/2017/model3d" xmlns:o="urn:schemas-microsoft-com:office:office" xmlns:oel="http://schemas.microsoft.com/office/2019/extlst" xmlns:r="http://schemas.openxmlformats.org/officeDocument/2006/relationships" xmlns:m="http://schemas.openxmlformats.org/officeDocument/2006/math" xmlns:v="urn:schemas-microsoft-com:vml" xmlns:wp14="http://schemas.microsoft.com/office/word/2010/wordprocessingDrawing" xmlns:wp="http://schemas.openxmlformats.org/drawingml/2006/wordprocessingDrawing" xmlns:w10="urn:schemas-microsoft-com:office:word" xmlns:w="http://schemas.openxmlformats.org/wordprocessingml/2006/main" xmlns:w14="http://schemas.microsoft.com/office/word/2010/wordml" xmlns:w15="http://schemas.microsoft.com/office/word/2012/wordml" xmlns:w16cex="http://schemas.microsoft.com/office/word/2018/wordml/cex" xmlns:w16cid="http://schemas.microsoft.com/office/word/2016/wordml/cid" xmlns:w16="http://schemas.microsoft.com/office/word/2018/wordml" xmlns:w16du="http://schemas.microsoft.com/office/word/2023/wordml/word16du" xmlns:w16sdtdh="http://schemas.microsoft.com/office/word/2020/wordml/sdtdatahash" xmlns:w16sdtfl="http://schemas.microsoft.com/office/word/2024/wordml/sdtformatlock" xmlns:w16se="http://schemas.microsoft.com/office/word/2015/wordml/symex" xmlns:wpg="http://schemas.microsoft.com/office/word/2010/wordprocessingGroup" xmlns:wpi="http://schemas.microsoft.com/office/word/2010/wordprocessingInk" xmlns:wne="http://schemas.microsoft.com/office/word/2006/wordml" xmlns:wps="http://schemas.microsoft.com/office/word/2010/wordprocessingShape" mc:Ignorable="w14 w15 w16se w16cid w16 w16cex w16sdtdh w16sdtfl w16du wp14">
-  <w:p>
-    <w:pPr>
-      <w:pStyle w:val="Header"/>
-      <w:ind w:firstLine="0"/>
-      <w:jc w:val="left"/>
-    </w:pPr>
-  </w:p>
-</w:hdr>
-</file>
-
-<file path=word/header2.xml><?xml version="1.0" encoding="utf-8"?>
 <w:hdr xmlns:wpc="http://schemas.microsoft.com/office/word/2010/wordprocessingCanvas" xmlns:cx="http://schemas.microsoft.com/office/drawing/2014/chartex" xmlns:cx1="http://schemas.microsoft.com/office/drawing/2015/9/8/chartex" xmlns:cx2="http://schemas.microsoft.com/office/drawing/2015/10/21/chartex" xmlns:cx3="http://schemas.microsoft.com/office/drawing/2016/5/9/chartex" xmlns:cx4="http://schemas.microsoft.com/office/drawing/2016/5/10/chartex" xmlns:cx5="http://schemas.microsoft.com/office/drawing/2016/5/11/chartex" xmlns:cx6="http://schemas.microsoft.com/office/drawing/2016/5/12/chartex" xmlns:cx7="http://schemas.microsoft.com/office/drawing/2016/5/13/chartex" xmlns:cx8="http://schemas.microsoft.com/office/drawing/2016/5/14/chartex" xmlns:mc="http://schemas.openxmlformats.org/markup-compatibility/2006" xmlns:aink="http://schemas.microsoft.com/office/drawing/2016/ink" xmlns:am3d="http://schemas.microsoft.com/office/drawing/2017/model3d" xmlns:o="urn:schemas-microsoft-com:office:office" xmlns:oel="http://schemas.microsoft.com/office/2019/extlst" xmlns:r="http://schemas.openxmlformats.org/officeDocument/2006/relationships" xmlns:m="http://schemas.openxmlformats.org/officeDocument/2006/math" xmlns:v="urn:schemas-microsoft-com:vml" xmlns:wp14="http://schemas.microsoft.com/office/word/2010/wordprocessingDrawing" xmlns:wp="http://schemas.openxmlformats.org/drawingml/2006/wordprocessingDrawing" xmlns:w10="urn:schemas-microsoft-com:office:word" xmlns:w="http://schemas.openxmlformats.org/wordprocessingml/2006/main" xmlns:w14="http://schemas.microsoft.com/office/word/2010/wordml" xmlns:w15="http://schemas.microsoft.com/office/word/2012/wordml" xmlns:w16cex="http://schemas.microsoft.com/office/word/2018/wordml/cex" xmlns:w16cid="http://schemas.microsoft.com/office/word/2016/wordml/cid" xmlns:w16="http://schemas.microsoft.com/office/word/2018/wordml" xmlns:w16du="http://schemas.microsoft.com/office/word/2023/wordml/word16du" xmlns:w16sdtdh="http://schemas.microsoft.com/office/word/2020/wordml/sdtdatahash" xmlns:w16sdtfl="http://schemas.microsoft.com/office/word/2024/wordml/sdtformatlock" xmlns:w16se="http://schemas.microsoft.com/office/word/2015/wordml/symex" xmlns:wpg="http://schemas.microsoft.com/office/word/2010/wordprocessingGroup" xmlns:wpi="http://schemas.microsoft.com/office/word/2010/wordprocessingInk" xmlns:wne="http://schemas.microsoft.com/office/word/2006/wordml" xmlns:wps="http://schemas.microsoft.com/office/word/2010/wordprocessingShape" mc:Ignorable="w14 w15 w16se w16cid w16 w16cex w16sdtdh w16sdtfl w16du wp14">
   <w:p>
     <w:pPr>

</xml_diff>